<commit_message>
Update docs and add HANDOFF
</commit_message>
<xml_diff>
--- a/docs/DESIGN-FLAWS.docx
+++ b/docs/DESIGN-FLAWS.docx
@@ -1356,10 +1356,10 @@
     <w:p>
       <w:pPr>
         <w:pStyle w:val="ListParagraph"/>
-        <w:ind w:left="360" w:hanging="360"/>
         <w:tabs>
           <w:tab w:val="left" w:pos="360"/>
         </w:tabs>
+        <w:ind w:left="360" w:hanging="360"/>
       </w:pPr>
       <w:r>
         <w:t xml:space="preserve">•	</w:t>
@@ -1376,10 +1376,10 @@
     <w:p>
       <w:pPr>
         <w:pStyle w:val="ListParagraph"/>
-        <w:ind w:left="360" w:hanging="360"/>
         <w:tabs>
           <w:tab w:val="left" w:pos="360"/>
         </w:tabs>
+        <w:ind w:left="360" w:hanging="360"/>
       </w:pPr>
       <w:r>
         <w:t xml:space="preserve">•	</w:t>
@@ -1391,10 +1391,10 @@
     <w:p>
       <w:pPr>
         <w:pStyle w:val="ListParagraph"/>
-        <w:ind w:left="360" w:hanging="360"/>
         <w:tabs>
           <w:tab w:val="left" w:pos="360"/>
         </w:tabs>
+        <w:ind w:left="360" w:hanging="360"/>
       </w:pPr>
       <w:r>
         <w:t xml:space="preserve">•	</w:t>
@@ -2299,10 +2299,10 @@
   <w:style w:type="paragraph" w:styleId="Title">
     <w:name w:val="Title"/>
     <w:pPr>
-      <w:spacing w:before="0" w:after="240"/>
       <w:pBdr>
         <w:bottom w:val="single" w:sz="12" w:space="4" w:color="2E5A3E"/>
       </w:pBdr>
+      <w:spacing w:before="0" w:after="240"/>
     </w:pPr>
     <w:rPr>
       <w:rFonts w:ascii="Calibri Light" w:hAnsi="Calibri Light"/>
@@ -2367,11 +2367,11 @@
     <w:name w:val="Quote"/>
     <w:basedOn w:val="Normal"/>
     <w:pPr>
-      <w:ind w:left="360"/>
       <w:pBdr>
         <w:left w:val="single" w:sz="18" w:space="8" w:color="C9B27A"/>
       </w:pBdr>
       <w:spacing w:before="80" w:after="80"/>
+      <w:ind w:left="360"/>
     </w:pPr>
     <w:rPr>
       <w:i/>
@@ -2382,8 +2382,8 @@
     <w:name w:val="Code Block"/>
     <w:basedOn w:val="Normal"/>
     <w:pPr>
+      <w:shd w:val="clear" w:color="auto" w:fill="F4F4F2"/>
       <w:spacing w:after="0" w:line="240" w:lineRule="auto"/>
-      <w:shd w:val="clear" w:color="auto" w:fill="F4F4F2"/>
       <w:ind w:left="120"/>
     </w:pPr>
     <w:rPr>

</xml_diff>